<commit_message>
Interface: cartões de totais redesenhados, fotografias laterais e documentação atualizada
</commit_message>
<xml_diff>
--- a/docs/AgroGest_Guia_de_Instalacao.docx
+++ b/docs/AgroGest_Guia_de_Instalacao.docx
@@ -12,7 +12,7 @@
           <w:noProof/>
         </w:rPr>
         <w:drawing>
-          <wp:inline distT="0" distB="0" distL="0" distR="0" wp14:anchorId="084261BD" wp14:editId="75AC4109">
+          <wp:inline distT="0" distB="0" distL="0" distR="0" wp14:anchorId="0AB5D5AF" wp14:editId="7CD35E3B">
             <wp:extent cx="1440000" cy="1440000"/>
             <wp:effectExtent l="0" t="0" r="0" b="0"/>
             <wp:docPr id="1" name="Picture 1"/>
@@ -206,7 +206,7 @@
       <w:r>
         <w:fldChar w:fldCharType="separate"/>
       </w:r>
-      <w:hyperlink w:anchor="_Toc244110590" w:history="1">
+      <w:hyperlink w:anchor="_Toc244119057" w:history="1">
         <w:r>
           <w:rPr>
             <w:rStyle w:val="Hyperlink"/>
@@ -233,7 +233,7 @@
             <w:noProof/>
             <w:webHidden/>
           </w:rPr>
-          <w:instrText xml:space="preserve"> PAGEREF _Toc244110590 \h </w:instrText>
+          <w:instrText xml:space="preserve"> PAGEREF _Toc244119057 \h </w:instrText>
         </w:r>
         <w:r>
           <w:rPr>
@@ -276,7 +276,7 @@
           <w:lang w:val="pt-MZ" w:eastAsia="pt-MZ"/>
         </w:rPr>
       </w:pPr>
-      <w:hyperlink w:anchor="_Toc244110591" w:history="1">
+      <w:hyperlink w:anchor="_Toc244119058" w:history="1">
         <w:r>
           <w:rPr>
             <w:rStyle w:val="Hyperlink"/>
@@ -303,7 +303,7 @@
             <w:noProof/>
             <w:webHidden/>
           </w:rPr>
-          <w:instrText xml:space="preserve"> PAGEREF _Toc244110591 \h </w:instrText>
+          <w:instrText xml:space="preserve"> PAGEREF _Toc244119058 \h </w:instrText>
         </w:r>
         <w:r>
           <w:rPr>
@@ -346,7 +346,7 @@
           <w:lang w:val="pt-MZ" w:eastAsia="pt-MZ"/>
         </w:rPr>
       </w:pPr>
-      <w:hyperlink w:anchor="_Toc244110592" w:history="1">
+      <w:hyperlink w:anchor="_Toc244119059" w:history="1">
         <w:r>
           <w:rPr>
             <w:rStyle w:val="Hyperlink"/>
@@ -373,7 +373,7 @@
             <w:noProof/>
             <w:webHidden/>
           </w:rPr>
-          <w:instrText xml:space="preserve"> PAGEREF _Toc244110592 \h </w:instrText>
+          <w:instrText xml:space="preserve"> PAGEREF _Toc244119059 \h </w:instrText>
         </w:r>
         <w:r>
           <w:rPr>
@@ -416,7 +416,7 @@
           <w:lang w:val="pt-MZ" w:eastAsia="pt-MZ"/>
         </w:rPr>
       </w:pPr>
-      <w:hyperlink w:anchor="_Toc244110593" w:history="1">
+      <w:hyperlink w:anchor="_Toc244119060" w:history="1">
         <w:r>
           <w:rPr>
             <w:rStyle w:val="Hyperlink"/>
@@ -443,7 +443,7 @@
             <w:noProof/>
             <w:webHidden/>
           </w:rPr>
-          <w:instrText xml:space="preserve"> PAGEREF _Toc244110593 \h </w:instrText>
+          <w:instrText xml:space="preserve"> PAGEREF _Toc244119060 \h </w:instrText>
         </w:r>
         <w:r>
           <w:rPr>
@@ -486,7 +486,7 @@
           <w:lang w:val="pt-MZ" w:eastAsia="pt-MZ"/>
         </w:rPr>
       </w:pPr>
-      <w:hyperlink w:anchor="_Toc244110594" w:history="1">
+      <w:hyperlink w:anchor="_Toc244119061" w:history="1">
         <w:r>
           <w:rPr>
             <w:rStyle w:val="Hyperlink"/>
@@ -513,7 +513,7 @@
             <w:noProof/>
             <w:webHidden/>
           </w:rPr>
-          <w:instrText xml:space="preserve"> PAGEREF _Toc244110594 \h </w:instrText>
+          <w:instrText xml:space="preserve"> PAGEREF _Toc244119061 \h </w:instrText>
         </w:r>
         <w:r>
           <w:rPr>
@@ -556,7 +556,7 @@
           <w:lang w:val="pt-MZ" w:eastAsia="pt-MZ"/>
         </w:rPr>
       </w:pPr>
-      <w:hyperlink w:anchor="_Toc244110595" w:history="1">
+      <w:hyperlink w:anchor="_Toc244119062" w:history="1">
         <w:r>
           <w:rPr>
             <w:rStyle w:val="Hyperlink"/>
@@ -583,7 +583,7 @@
             <w:noProof/>
             <w:webHidden/>
           </w:rPr>
-          <w:instrText xml:space="preserve"> PAGEREF _Toc244110595 \h </w:instrText>
+          <w:instrText xml:space="preserve"> PAGEREF _Toc244119062 \h </w:instrText>
         </w:r>
         <w:r>
           <w:rPr>
@@ -626,7 +626,7 @@
           <w:lang w:val="pt-MZ" w:eastAsia="pt-MZ"/>
         </w:rPr>
       </w:pPr>
-      <w:hyperlink w:anchor="_Toc244110596" w:history="1">
+      <w:hyperlink w:anchor="_Toc244119063" w:history="1">
         <w:r>
           <w:rPr>
             <w:rStyle w:val="Hyperlink"/>
@@ -653,7 +653,7 @@
             <w:noProof/>
             <w:webHidden/>
           </w:rPr>
-          <w:instrText xml:space="preserve"> PAGEREF _Toc244110596 \h </w:instrText>
+          <w:instrText xml:space="preserve"> PAGEREF _Toc244119063 \h </w:instrText>
         </w:r>
         <w:r>
           <w:rPr>
@@ -696,7 +696,7 @@
           <w:lang w:val="pt-MZ" w:eastAsia="pt-MZ"/>
         </w:rPr>
       </w:pPr>
-      <w:hyperlink w:anchor="_Toc244110597" w:history="1">
+      <w:hyperlink w:anchor="_Toc244119064" w:history="1">
         <w:r>
           <w:rPr>
             <w:rStyle w:val="Hyperlink"/>
@@ -723,7 +723,7 @@
             <w:noProof/>
             <w:webHidden/>
           </w:rPr>
-          <w:instrText xml:space="preserve"> PAGEREF _Toc244110597 \h </w:instrText>
+          <w:instrText xml:space="preserve"> PAGEREF _Toc244119064 \h </w:instrText>
         </w:r>
         <w:r>
           <w:rPr>
@@ -766,7 +766,7 @@
           <w:lang w:val="pt-MZ" w:eastAsia="pt-MZ"/>
         </w:rPr>
       </w:pPr>
-      <w:hyperlink w:anchor="_Toc244110598" w:history="1">
+      <w:hyperlink w:anchor="_Toc244119065" w:history="1">
         <w:r>
           <w:rPr>
             <w:rStyle w:val="Hyperlink"/>
@@ -793,7 +793,7 @@
             <w:noProof/>
             <w:webHidden/>
           </w:rPr>
-          <w:instrText xml:space="preserve"> PAGEREF _Toc244110598 \h </w:instrText>
+          <w:instrText xml:space="preserve"> PAGEREF _Toc244119065 \h </w:instrText>
         </w:r>
         <w:r>
           <w:rPr>
@@ -836,7 +836,7 @@
           <w:lang w:val="pt-MZ" w:eastAsia="pt-MZ"/>
         </w:rPr>
       </w:pPr>
-      <w:hyperlink w:anchor="_Toc244110599" w:history="1">
+      <w:hyperlink w:anchor="_Toc244119066" w:history="1">
         <w:r>
           <w:rPr>
             <w:rStyle w:val="Hyperlink"/>
@@ -863,7 +863,7 @@
             <w:noProof/>
             <w:webHidden/>
           </w:rPr>
-          <w:instrText xml:space="preserve"> PAGEREF _Toc244110599 \h </w:instrText>
+          <w:instrText xml:space="preserve"> PAGEREF _Toc244119066 \h </w:instrText>
         </w:r>
         <w:r>
           <w:rPr>
@@ -906,7 +906,7 @@
           <w:lang w:val="pt-MZ" w:eastAsia="pt-MZ"/>
         </w:rPr>
       </w:pPr>
-      <w:hyperlink w:anchor="_Toc244110600" w:history="1">
+      <w:hyperlink w:anchor="_Toc244119067" w:history="1">
         <w:r>
           <w:rPr>
             <w:rStyle w:val="Hyperlink"/>
@@ -933,7 +933,7 @@
             <w:noProof/>
             <w:webHidden/>
           </w:rPr>
-          <w:instrText xml:space="preserve"> PAGEREF _Toc244110600 \h </w:instrText>
+          <w:instrText xml:space="preserve"> PAGEREF _Toc244119067 \h </w:instrText>
         </w:r>
         <w:r>
           <w:rPr>
@@ -976,7 +976,7 @@
           <w:lang w:val="pt-MZ" w:eastAsia="pt-MZ"/>
         </w:rPr>
       </w:pPr>
-      <w:hyperlink w:anchor="_Toc244110601" w:history="1">
+      <w:hyperlink w:anchor="_Toc244119068" w:history="1">
         <w:r>
           <w:rPr>
             <w:rStyle w:val="Hyperlink"/>
@@ -1003,7 +1003,7 @@
             <w:noProof/>
             <w:webHidden/>
           </w:rPr>
-          <w:instrText xml:space="preserve"> PAGEREF _Toc244110601 \h </w:instrText>
+          <w:instrText xml:space="preserve"> PAGEREF _Toc244119068 \h </w:instrText>
         </w:r>
         <w:r>
           <w:rPr>
@@ -1046,7 +1046,7 @@
           <w:lang w:val="pt-MZ" w:eastAsia="pt-MZ"/>
         </w:rPr>
       </w:pPr>
-      <w:hyperlink w:anchor="_Toc244110602" w:history="1">
+      <w:hyperlink w:anchor="_Toc244119069" w:history="1">
         <w:r>
           <w:rPr>
             <w:rStyle w:val="Hyperlink"/>
@@ -1073,7 +1073,7 @@
             <w:noProof/>
             <w:webHidden/>
           </w:rPr>
-          <w:instrText xml:space="preserve"> PAGEREF _Toc244110602 \h </w:instrText>
+          <w:instrText xml:space="preserve"> PAGEREF _Toc244119069 \h </w:instrText>
         </w:r>
         <w:r>
           <w:rPr>
@@ -1116,7 +1116,7 @@
           <w:lang w:val="pt-MZ" w:eastAsia="pt-MZ"/>
         </w:rPr>
       </w:pPr>
-      <w:hyperlink w:anchor="_Toc244110603" w:history="1">
+      <w:hyperlink w:anchor="_Toc244119070" w:history="1">
         <w:r>
           <w:rPr>
             <w:rStyle w:val="Hyperlink"/>
@@ -1143,7 +1143,7 @@
             <w:noProof/>
             <w:webHidden/>
           </w:rPr>
-          <w:instrText xml:space="preserve"> PAGEREF _Toc244110603 \h </w:instrText>
+          <w:instrText xml:space="preserve"> PAGEREF _Toc244119070 \h </w:instrText>
         </w:r>
         <w:r>
           <w:rPr>
@@ -1186,7 +1186,7 @@
           <w:lang w:val="pt-MZ" w:eastAsia="pt-MZ"/>
         </w:rPr>
       </w:pPr>
-      <w:hyperlink w:anchor="_Toc244110604" w:history="1">
+      <w:hyperlink w:anchor="_Toc244119071" w:history="1">
         <w:r>
           <w:rPr>
             <w:rStyle w:val="Hyperlink"/>
@@ -1213,7 +1213,7 @@
             <w:noProof/>
             <w:webHidden/>
           </w:rPr>
-          <w:instrText xml:space="preserve"> PAGEREF _Toc244110604 \h </w:instrText>
+          <w:instrText xml:space="preserve"> PAGEREF _Toc244119071 \h </w:instrText>
         </w:r>
         <w:r>
           <w:rPr>
@@ -1256,7 +1256,7 @@
           <w:lang w:val="pt-MZ" w:eastAsia="pt-MZ"/>
         </w:rPr>
       </w:pPr>
-      <w:hyperlink w:anchor="_Toc244110605" w:history="1">
+      <w:hyperlink w:anchor="_Toc244119072" w:history="1">
         <w:r>
           <w:rPr>
             <w:rStyle w:val="Hyperlink"/>
@@ -1283,7 +1283,7 @@
             <w:noProof/>
             <w:webHidden/>
           </w:rPr>
-          <w:instrText xml:space="preserve"> PAGEREF _Toc244110605 \h </w:instrText>
+          <w:instrText xml:space="preserve"> PAGEREF _Toc244119072 \h </w:instrText>
         </w:r>
         <w:r>
           <w:rPr>
@@ -1326,7 +1326,7 @@
           <w:lang w:val="pt-MZ" w:eastAsia="pt-MZ"/>
         </w:rPr>
       </w:pPr>
-      <w:hyperlink w:anchor="_Toc244110606" w:history="1">
+      <w:hyperlink w:anchor="_Toc244119073" w:history="1">
         <w:r>
           <w:rPr>
             <w:rStyle w:val="Hyperlink"/>
@@ -1353,7 +1353,7 @@
             <w:noProof/>
             <w:webHidden/>
           </w:rPr>
-          <w:instrText xml:space="preserve"> PAGEREF _Toc244110606 \h </w:instrText>
+          <w:instrText xml:space="preserve"> PAGEREF _Toc244119073 \h </w:instrText>
         </w:r>
         <w:r>
           <w:rPr>
@@ -1396,7 +1396,7 @@
           <w:lang w:val="pt-MZ" w:eastAsia="pt-MZ"/>
         </w:rPr>
       </w:pPr>
-      <w:hyperlink w:anchor="_Toc244110607" w:history="1">
+      <w:hyperlink w:anchor="_Toc244119074" w:history="1">
         <w:r>
           <w:rPr>
             <w:rStyle w:val="Hyperlink"/>
@@ -1423,7 +1423,7 @@
             <w:noProof/>
             <w:webHidden/>
           </w:rPr>
-          <w:instrText xml:space="preserve"> PAGEREF _Toc244110607 \h </w:instrText>
+          <w:instrText xml:space="preserve"> PAGEREF _Toc244119074 \h </w:instrText>
         </w:r>
         <w:r>
           <w:rPr>
@@ -1468,7 +1468,7 @@
       <w:pPr>
         <w:pStyle w:val="Heading1"/>
       </w:pPr>
-      <w:bookmarkStart w:id="0" w:name="_Toc244110590"/>
+      <w:bookmarkStart w:id="0" w:name="_Toc244119057"/>
       <w:r>
         <w:lastRenderedPageBreak/>
         <w:t>1. O que vai ser instalado</w:t>
@@ -1477,7 +1477,10 @@
     </w:p>
     <w:p>
       <w:r>
-        <w:t>Para pôr o AgroGest a funcionar são necessárias três peças. O Maven só é preciso para voltar a compilar o código; para apenas correr a aplicação basta o ficheiro agrogest.war já entregue.</w:t>
+        <w:t>Para pôr o AgroGest a funcionar são necessárias três peças.</w:t>
+      </w:r>
+      <w:r>
+        <w:t xml:space="preserve"> O Maven só é preciso para voltar a compilar o código; para apenas correr a aplicação basta o ficheiro agrogest.war já entregue.</w:t>
       </w:r>
     </w:p>
     <w:tbl>
@@ -1627,7 +1630,10 @@
               <w:jc w:val="left"/>
             </w:pPr>
             <w:r>
-              <w:t>Servidor de aplicações onde o WAR é publicado</w:t>
+              <w:t xml:space="preserve">Servidor de </w:t>
+            </w:r>
+            <w:r>
+              <w:t>aplicações onde o WAR é publicado</w:t>
             </w:r>
           </w:p>
         </w:tc>
@@ -1749,7 +1755,10 @@
         <w:t>agrogest-codigo-fonte.zip</w:t>
       </w:r>
       <w:r>
-        <w:t>: projeto Maven completo (código, JSP, CSS, README.md e pasta deploy com os scripts de instalação e o serviço systemd);</w:t>
+        <w:t xml:space="preserve">: projeto Maven completo (código, JSP, CSS, </w:t>
+      </w:r>
+      <w:r>
+        <w:t>README.md e pasta deploy com os scripts de instalação e o serviço systemd);</w:t>
       </w:r>
     </w:p>
     <w:p>
@@ -1797,7 +1806,10 @@
         <w:t>AgroGest_Manual_de_Utilizacao.pdf</w:t>
       </w:r>
       <w:r>
-        <w:t>: passo a passo das operações do administrador e do cliente;</w:t>
+        <w:t xml:space="preserve">: passo a passo das operações do administrador e do </w:t>
+      </w:r>
+      <w:r>
+        <w:t>cliente;</w:t>
       </w:r>
     </w:p>
     <w:p>
@@ -1828,7 +1840,7 @@
       <w:pPr>
         <w:pStyle w:val="Heading1"/>
       </w:pPr>
-      <w:bookmarkStart w:id="1" w:name="_Toc244110591"/>
+      <w:bookmarkStart w:id="1" w:name="_Toc244119058"/>
       <w:r>
         <w:t>2. Instalação no Windows</w:t>
       </w:r>
@@ -1838,7 +1850,7 @@
       <w:pPr>
         <w:pStyle w:val="Heading2"/>
       </w:pPr>
-      <w:bookmarkStart w:id="2" w:name="_Toc244110592"/>
+      <w:bookmarkStart w:id="2" w:name="_Toc244119059"/>
       <w:r>
         <w:t>2.1 Instalar o Java 17</w:t>
       </w:r>
@@ -1873,7 +1885,10 @@
       </w:r>
       <w:r>
         <w:tab/>
-        <w:t>Escolher Sistema operativo Windows, Arquitetura x64, Tipo JDK e descarregar o ficheiro .msi.</w:t>
+        <w:t>Escolher Sistema operativo Windows, Arquitetura x64, Tipo JDK e descarregar o ficheir</w:t>
+      </w:r>
+      <w:r>
+        <w:t>o .msi.</w:t>
       </w:r>
     </w:p>
     <w:p>
@@ -1939,7 +1954,10 @@
       </w:r>
       <w:r>
         <w:tab/>
-        <w:t>Abrir uma nova janela da Linha de Comandos (tecla Windows, escrever cmd, Enter) e confirmar:</w:t>
+        <w:t>Abrir uma nova ja</w:t>
+      </w:r>
+      <w:r>
+        <w:t>nela da Linha de Comandos (tecla Windows, escrever cmd, Enter) e confirmar:</w:t>
       </w:r>
     </w:p>
     <w:p>
@@ -1974,6 +1992,7 @@
     </w:p>
     <w:p>
       <w:r>
+        <w:lastRenderedPageBreak/>
         <w:t>Deve aparecer a versão 17 e o caminho da pasta do JDK (por exemplo C:\Program Files\Eclipse Adoptium\jdk-17...).</w:t>
       </w:r>
     </w:p>
@@ -1981,7 +2000,7 @@
       <w:pPr>
         <w:pStyle w:val="Heading2"/>
       </w:pPr>
-      <w:bookmarkStart w:id="3" w:name="_Toc244110593"/>
+      <w:bookmarkStart w:id="3" w:name="_Toc244119060"/>
       <w:r>
         <w:t>2.2 Instalar o Tomcat 10.1</w:t>
       </w:r>
@@ -2000,6 +2019,8 @@
       </w:r>
       <w:r>
         <w:tab/>
+      </w:r>
+      <w:r>
         <w:t>Abrir https://tomcat.apache.org/download-10.cgi.</w:t>
       </w:r>
     </w:p>
@@ -2057,9 +2078,12 @@
       <w:pPr>
         <w:pStyle w:val="Heading2"/>
       </w:pPr>
-      <w:bookmarkStart w:id="4" w:name="_Toc244110594"/>
-      <w:r>
-        <w:t>2.3 Mudar a porta para 8081</w:t>
+      <w:bookmarkStart w:id="4" w:name="_Toc244119061"/>
+      <w:r>
+        <w:t>2.3 Mu</w:t>
+      </w:r>
+      <w:r>
+        <w:t>dar a porta para 8081</w:t>
       </w:r>
       <w:bookmarkEnd w:id="4"/>
     </w:p>
@@ -2112,7 +2136,14 @@
           <w:rFonts w:ascii="Courier New" w:eastAsia="Courier New" w:hAnsi="Courier New" w:cs="Courier New"/>
           <w:sz w:val="20"/>
         </w:rPr>
-        <w:t>&lt;Connector port="8080" protocol="HTTP/1.1"</w:t>
+        <w:t>&lt;Connector por</w:t>
+      </w:r>
+      <w:r>
+        <w:rPr>
+          <w:rFonts w:ascii="Courier New" w:eastAsia="Courier New" w:hAnsi="Courier New" w:cs="Courier New"/>
+          <w:sz w:val="20"/>
+        </w:rPr>
+        <w:t>t="8080" protocol="HTTP/1.1"</w:t>
       </w:r>
     </w:p>
     <w:p>
@@ -2174,7 +2205,7 @@
       <w:pPr>
         <w:pStyle w:val="Heading2"/>
       </w:pPr>
-      <w:bookmarkStart w:id="5" w:name="_Toc244110595"/>
+      <w:bookmarkStart w:id="5" w:name="_Toc244119062"/>
       <w:r>
         <w:t>2.4 Publicar o WAR (deploy)</w:t>
       </w:r>
@@ -2209,7 +2240,10 @@
       </w:r>
       <w:r>
         <w:tab/>
-        <w:t>Na Linha de Comandos, iniciar o Tomcat:</w:t>
+        <w:t>Na Linha de C</w:t>
+      </w:r>
+      <w:r>
+        <w:t>omandos, iniciar o Tomcat:</w:t>
       </w:r>
     </w:p>
     <w:p>
@@ -2255,7 +2289,10 @@
       </w:r>
       <w:r>
         <w:tab/>
-        <w:t>Abre-se uma segunda janela com os registos do Tomcat. Esperar até aparecer a linha "Server startup in [...] milliseconds". O Tomcat extrai sozinho o WAR para a pasta webapps\agrogest.</w:t>
+        <w:t xml:space="preserve">Abre-se uma segunda janela com os registos do Tomcat. Esperar até aparecer a linha "Server startup in [...] milliseconds". O Tomcat extrai sozinho o WAR para a pasta </w:t>
+      </w:r>
+      <w:r>
+        <w:t>webapps\agrogest.</w:t>
       </w:r>
     </w:p>
     <w:p>
@@ -2321,7 +2358,7 @@
       <w:pPr>
         <w:pStyle w:val="Heading2"/>
       </w:pPr>
-      <w:bookmarkStart w:id="6" w:name="_Toc244110596"/>
+      <w:bookmarkStart w:id="6" w:name="_Toc244119063"/>
       <w:r>
         <w:t>2.5 Parar o Tomcat</w:t>
       </w:r>
@@ -2359,13 +2396,20 @@
     </w:p>
     <w:p>
       <w:r>
+        <w:lastRenderedPageBreak/>
         <w:t xml:space="preserve">Use sempre o shutdown.bat para parar: é nesse momento que o AgroGest grava automaticamente os dados em C:\tomcat\data\agrogest.ser. No arranque seguinte, os dados são restaurados. Também é possível gravar a qualquer momento no menu </w:t>
       </w:r>
       <w:r>
         <w:rPr>
           <w:b/>
         </w:rPr>
-        <w:t>Persistência &gt; Gravar agora</w:t>
+        <w:t>Persistência &gt; Gravar ag</w:t>
+      </w:r>
+      <w:r>
+        <w:rPr>
+          <w:b/>
+        </w:rPr>
+        <w:t>ora</w:t>
       </w:r>
       <w:r>
         <w:t>.</w:t>
@@ -2375,7 +2419,7 @@
       <w:pPr>
         <w:pStyle w:val="Heading2"/>
       </w:pPr>
-      <w:bookmarkStart w:id="7" w:name="_Toc244110597"/>
+      <w:bookmarkStart w:id="7" w:name="_Toc244119064"/>
       <w:r>
         <w:t>2.6 Publicar uma nova versão</w:t>
       </w:r>
@@ -2431,14 +2475,17 @@
     </w:p>
     <w:p>
       <w:r>
-        <w:t>Para recomeçar com dados limpos, apagar também C:\tomcat\data\agrogest.ser com o Tomcat parado.</w:t>
+        <w:t>Para recomeçar com da</w:t>
+      </w:r>
+      <w:r>
+        <w:t>dos limpos, apagar também C:\tomcat\data\agrogest.ser com o Tomcat parado.</w:t>
       </w:r>
     </w:p>
     <w:p>
       <w:pPr>
         <w:pStyle w:val="Heading1"/>
       </w:pPr>
-      <w:bookmarkStart w:id="8" w:name="_Toc244110598"/>
+      <w:bookmarkStart w:id="8" w:name="_Toc244119065"/>
       <w:r>
         <w:t>3. Compilar o código-fonte (opcional)</w:t>
       </w:r>
@@ -2462,7 +2509,10 @@
       </w:r>
       <w:r>
         <w:tab/>
-        <w:t xml:space="preserve">Abrir https://maven.apache.org/download.cgi e descarregar o </w:t>
+        <w:t>Abrir https://maven.apache.org/downlo</w:t>
+      </w:r>
+      <w:r>
+        <w:t xml:space="preserve">ad.cgi e descarregar o </w:t>
       </w:r>
       <w:r>
         <w:rPr>
@@ -2512,7 +2562,10 @@
         <w:t>Editar as variáveis de ambiente do sistema &gt; Variáveis de Ambiente</w:t>
       </w:r>
       <w:r>
-        <w:t>, selecionar Path &gt; Editar &gt; Novo &gt; escrever C:\maven\bin &gt; OK.</w:t>
+        <w:t>, s</w:t>
+      </w:r>
+      <w:r>
+        <w:t>elecionar Path &gt; Editar &gt; Novo &gt; escrever C:\maven\bin &gt; OK.</w:t>
       </w:r>
     </w:p>
     <w:p>
@@ -2559,7 +2612,14 @@
           <w:rFonts w:ascii="Courier New" w:eastAsia="Courier New" w:hAnsi="Courier New" w:cs="Courier New"/>
           <w:sz w:val="20"/>
         </w:rPr>
-        <w:t>cd C:\projetos\agrogest</w:t>
+        <w:t>cd C:\projetos\agroges</w:t>
+      </w:r>
+      <w:r>
+        <w:rPr>
+          <w:rFonts w:ascii="Courier New" w:eastAsia="Courier New" w:hAnsi="Courier New" w:cs="Courier New"/>
+          <w:sz w:val="20"/>
+        </w:rPr>
+        <w:t>t</w:t>
       </w:r>
     </w:p>
     <w:p>
@@ -2579,7 +2639,10 @@
     </w:p>
     <w:p>
       <w:r>
-        <w:t xml:space="preserve">No fim deve aparecer BUILD SUCCESS e o ficheiro target\agrogest.war. Publicar esse ficheiro como na secção 2.6. O projeto também abre diretamente no IntelliJ IDEA, NetBeans ou Eclipse (abrir a pasta que contém o ficheiro pom.xml). Com o JDK em C:\tools\jdk17, o Maven em C:\tools\maven e o Tomcat em C:\tools\tomcat10, o script </w:t>
+        <w:t>No fim deve aparecer BUILD SUCCESS e o ficheiro target\agrogest.war. Publicar esse ficheiro como na secção 2.6. O projeto também abre diretamente no IntelliJ IDEA, NetBeans ou Eclipse (abrir a pasta que contém o ficheiro pom.xml). Com o JDK em C:\tools\jdk</w:t>
+      </w:r>
+      <w:r>
+        <w:t xml:space="preserve">17, o Maven em C:\tools\maven e o Tomcat em C:\tools\tomcat10, o script </w:t>
       </w:r>
       <w:r>
         <w:rPr>
@@ -2595,15 +2658,19 @@
       <w:pPr>
         <w:pStyle w:val="Heading1"/>
       </w:pPr>
-      <w:bookmarkStart w:id="9" w:name="_Toc244110599"/>
-      <w:r>
+      <w:bookmarkStart w:id="9" w:name="_Toc244119066"/>
+      <w:r>
+        <w:lastRenderedPageBreak/>
         <w:t>4. Deploy em Ubuntu Server (VirtualBox) com systemd</w:t>
       </w:r>
       <w:bookmarkEnd w:id="9"/>
     </w:p>
     <w:p>
       <w:r>
-        <w:t xml:space="preserve">O enunciado pede a gestão do serviço com systemd, que existe em Linux. O grupo usou uma máquina virtual </w:t>
+        <w:t>O enunciado pede a gestão do serviço com systemd, que exis</w:t>
+      </w:r>
+      <w:r>
+        <w:t xml:space="preserve">te em Linux. O grupo usou uma máquina virtual </w:t>
       </w:r>
       <w:r>
         <w:rPr>
@@ -2705,7 +2772,10 @@
               <w:jc w:val="left"/>
             </w:pPr>
             <w:r>
-              <w:t>Instala o Java 17 e o Tomcat 10.1 em /opt/tomcat, porta 8081, cria o utilizador tomcat, a pasta de dados e o serviço</w:t>
+              <w:t xml:space="preserve">Instala o Java 17 </w:t>
+            </w:r>
+            <w:r>
+              <w:t>e o Tomcat 10.1 em /opt/tomcat, porta 8081, cria o utilizador tomcat, a pasta de dados e o serviço</w:t>
             </w:r>
           </w:p>
         </w:tc>
@@ -2786,9 +2856,12 @@
       <w:pPr>
         <w:pStyle w:val="Heading2"/>
       </w:pPr>
-      <w:bookmarkStart w:id="10" w:name="_Toc244110600"/>
-      <w:r>
-        <w:t>4.1 Rede da máquina virtual</w:t>
+      <w:bookmarkStart w:id="10" w:name="_Toc244119067"/>
+      <w:r>
+        <w:t xml:space="preserve">4.1 Rede da </w:t>
+      </w:r>
+      <w:r>
+        <w:t>máquina virtual</w:t>
       </w:r>
       <w:bookmarkEnd w:id="10"/>
     </w:p>
@@ -2827,7 +2900,10 @@
         <w:t>Opção A, Placa em ponte (Bridged Adapter)</w:t>
       </w:r>
       <w:r>
-        <w:t>: a VM recebe um IP da mesma rede do Windows (ex.: 192.168.1.50), por isso colegas e telemóveis na mesma rede Wi-Fi conseguem abrir o AgroGest. Algumas redes (por exemplo, de universidades) isolam os dispositivos; nesse caso usar um hotspot do telemóvel ou a opção B.</w:t>
+        <w:t>: a VM recebe um IP da mesma rede do Windows (ex.: 192.168.1.50), por isso colegas e telemóveis na mesma rede Wi-Fi</w:t>
+      </w:r>
+      <w:r>
+        <w:t xml:space="preserve"> conseguem abrir o AgroGest. Algumas redes (por exemplo, de universidades) isolam os dispositivos; nesse caso usar um hotspot do telemóvel ou a opção B.</w:t>
       </w:r>
     </w:p>
     <w:p>
@@ -2851,7 +2927,13 @@
         <w:t>Opção B, NAT com reencaminhamento de portas</w:t>
       </w:r>
       <w:r>
-        <w:t>: em Avançado &gt; Reencaminhamento de portas, criar as regras agrogest (TCP, anfitrião 8081, convidado 8081) e ssh (TCP, anfitrião 2222, convidado 22). No Windows o sistema abre em http://localhost:8081/agrogest. Se o Tomcat do Windows estiver ligado, também usa a porta 8081: desligá-lo antes ou usar outra porta do anfitrião (por exemplo 8082).</w:t>
+        <w:t>: em Avançado &gt; Reencaminhamento de portas, criar as regra</w:t>
+      </w:r>
+      <w:r>
+        <w:t>s agrogest (TCP, anfitrião 8081, convidado 8081) e ssh (TCP, anfitrião 2222, convidado 22). No Windows o sistema abre em http://localhost:8081/agrogest. Se o Tomcat do Windows estiver ligado, também usa a porta 8081: desligá-lo antes ou usar outra porta do</w:t>
+      </w:r>
+      <w:r>
+        <w:t xml:space="preserve"> anfitrião (por exemplo 8082).</w:t>
       </w:r>
     </w:p>
     <w:p>
@@ -2893,7 +2975,7 @@
       <w:pPr>
         <w:pStyle w:val="Heading2"/>
       </w:pPr>
-      <w:bookmarkStart w:id="11" w:name="_Toc244110601"/>
+      <w:bookmarkStart w:id="11" w:name="_Toc244119068"/>
       <w:r>
         <w:t>4.2 Passar os ficheiros do Windows para a VM</w:t>
       </w:r>
@@ -2901,7 +2983,10 @@
     </w:p>
     <w:p>
       <w:r>
-        <w:t>É preciso levar para a VM a pasta deploy e o ficheiro agrogest.war. A forma mais simples é o scp, que já vem no Windows 10/11. Na VM, instalar o servidor SSH e ver o IP:</w:t>
+        <w:t xml:space="preserve">É preciso levar para a VM a pasta deploy e o ficheiro agrogest.war. A forma mais </w:t>
+      </w:r>
+      <w:r>
+        <w:t>simples é o scp, que já vem no Windows 10/11. Na VM, instalar o servidor SSH e ver o IP:</w:t>
       </w:r>
     </w:p>
     <w:p>
@@ -2936,7 +3021,10 @@
     </w:p>
     <w:p>
       <w:r>
-        <w:t>No PowerShell do Windows, dentro da pasta do projeto (trocar utilizador e IP):</w:t>
+        <w:t xml:space="preserve">No PowerShell do Windows, dentro da pasta do projeto (trocar utilizador </w:t>
+      </w:r>
+      <w:r>
+        <w:t>e IP):</w:t>
       </w:r>
     </w:p>
     <w:p>
@@ -3001,14 +3089,18 @@
     </w:p>
     <w:p>
       <w:r>
-        <w:t>Também é possível usar uma pasta partilhada do VirtualBox. Se o bash der erros como "$'\r': command not found", os scripts ficaram com fim de linha do Windows; corrigir com sudo apt install -y dos2unix &amp;&amp; dos2unix ~/deploy/*.sh ~/deploy/tomcat.service.</w:t>
+        <w:lastRenderedPageBreak/>
+        <w:t>Também é possível usar uma pasta partilhada do VirtualBox. Se o bash d</w:t>
+      </w:r>
+      <w:r>
+        <w:t>er erros como "$'\r': command not found", os scripts ficaram com fim de linha do Windows; corrigir com sudo apt install -y dos2unix &amp;&amp; dos2unix ~/deploy/*.sh ~/deploy/tomcat.service.</w:t>
       </w:r>
     </w:p>
     <w:p>
       <w:pPr>
         <w:pStyle w:val="Heading2"/>
       </w:pPr>
-      <w:bookmarkStart w:id="12" w:name="_Toc244110602"/>
+      <w:bookmarkStart w:id="12" w:name="_Toc244119069"/>
       <w:r>
         <w:t>4.3 Instalar o Tomcat 10.1 como serviço</w:t>
       </w:r>
@@ -3041,7 +3133,14 @@
           <w:rFonts w:ascii="Courier New" w:eastAsia="Courier New" w:hAnsi="Courier New" w:cs="Courier New"/>
           <w:sz w:val="20"/>
         </w:rPr>
-        <w:t>sudo bash install-tomcat.sh</w:t>
+        <w:t xml:space="preserve">sudo bash </w:t>
+      </w:r>
+      <w:r>
+        <w:rPr>
+          <w:rFonts w:ascii="Courier New" w:eastAsia="Courier New" w:hAnsi="Courier New" w:cs="Courier New"/>
+          <w:sz w:val="20"/>
+        </w:rPr>
+        <w:t>install-tomcat.sh</w:t>
       </w:r>
     </w:p>
     <w:p>
@@ -3110,7 +3209,10 @@
       </w:r>
       <w:r>
         <w:tab/>
-        <w:t>muda a porta HTTP para 8081 em /opt/tomcat/conf/server.xml;</w:t>
+        <w:t>muda a po</w:t>
+      </w:r>
+      <w:r>
+        <w:t>rta HTTP para 8081 em /opt/tomcat/conf/server.xml;</w:t>
       </w:r>
     </w:p>
     <w:p>
@@ -3158,14 +3260,17 @@
       </w:r>
       <w:r>
         <w:tab/>
-        <w:t>abre a porta 8081 na firewall se o ufw estiver ativo.</w:t>
+        <w:t>abre a porta 8081 na firewall se o ufw estiver a</w:t>
+      </w:r>
+      <w:r>
+        <w:t>tivo.</w:t>
       </w:r>
     </w:p>
     <w:p>
       <w:pPr>
         <w:pStyle w:val="Heading2"/>
       </w:pPr>
-      <w:bookmarkStart w:id="13" w:name="_Toc244110603"/>
+      <w:bookmarkStart w:id="13" w:name="_Toc244119070"/>
       <w:r>
         <w:t>4.4 Publicar o AgroGest</w:t>
       </w:r>
@@ -3210,9 +3315,12 @@
       <w:pPr>
         <w:pStyle w:val="Heading2"/>
       </w:pPr>
-      <w:bookmarkStart w:id="14" w:name="_Toc244110604"/>
-      <w:r>
-        <w:t>4.5 Gerir o serviço com systemd</w:t>
+      <w:bookmarkStart w:id="14" w:name="_Toc244119071"/>
+      <w:r>
+        <w:t>4.5 Geri</w:t>
+      </w:r>
+      <w:r>
+        <w:t>r o serviço com systemd</w:t>
       </w:r>
       <w:bookmarkEnd w:id="14"/>
     </w:p>
@@ -3363,7 +3471,10 @@
               <w:jc w:val="left"/>
             </w:pPr>
             <w:r>
-              <w:t>Inicia o serviço</w:t>
+              <w:t xml:space="preserve">Inicia o </w:t>
+            </w:r>
+            <w:r>
+              <w:t>serviço</w:t>
             </w:r>
           </w:p>
         </w:tc>
@@ -3462,7 +3573,10 @@
               <w:jc w:val="left"/>
             </w:pPr>
             <w:r>
-              <w:t>Mostra se está active (running) e as últimas linhas do registo</w:t>
+              <w:t xml:space="preserve">Mostra se está active (running) e as últimas linhas do </w:t>
+            </w:r>
+            <w:r>
+              <w:t>registo</w:t>
             </w:r>
           </w:p>
         </w:tc>
@@ -3495,7 +3609,11 @@
               <w:jc w:val="left"/>
             </w:pPr>
             <w:r>
-              <w:t>Acompanha os registos em tempo real (Ctrl+C para sair)</w:t>
+              <w:t xml:space="preserve">Acompanha os registos em tempo real (Ctrl+C </w:t>
+            </w:r>
+            <w:r>
+              <w:lastRenderedPageBreak/>
+              <w:t>para sair)</w:t>
             </w:r>
           </w:p>
         </w:tc>
@@ -3514,6 +3632,7 @@
               <w:jc w:val="left"/>
             </w:pPr>
             <w:r>
+              <w:lastRenderedPageBreak/>
               <w:t>sudo tail -f /opt/tomcat/logs/catalina.out</w:t>
             </w:r>
           </w:p>
@@ -3541,14 +3660,17 @@
     </w:p>
     <w:p>
       <w:r>
-        <w:t>Ao parar, o catalina.out mostra "AgroGest: estado gravado em /opt/tomcat/data/agrogest.ser"; ao arrancar, "AgroGest: estado restaurado de ...".</w:t>
+        <w:t xml:space="preserve">Ao parar, o catalina.out mostra "AgroGest: estado gravado em </w:t>
+      </w:r>
+      <w:r>
+        <w:t>/opt/tomcat/data/agrogest.ser"; ao arrancar, "AgroGest: estado restaurado de ...".</w:t>
       </w:r>
     </w:p>
     <w:p>
       <w:pPr>
         <w:pStyle w:val="Heading2"/>
       </w:pPr>
-      <w:bookmarkStart w:id="15" w:name="_Toc244110605"/>
+      <w:bookmarkStart w:id="15" w:name="_Toc244119072"/>
       <w:r>
         <w:t>4.6 Firewall e acesso pela rede</w:t>
       </w:r>
@@ -3596,7 +3718,14 @@
           <w:rFonts w:ascii="Courier New" w:eastAsia="Courier New" w:hAnsi="Courier New" w:cs="Courier New"/>
           <w:sz w:val="20"/>
         </w:rPr>
-        <w:t>ip a                        # IP da VM (linha "inet" da placa enp0s3)</w:t>
+        <w:t>ip a                        # IP</w:t>
+      </w:r>
+      <w:r>
+        <w:rPr>
+          <w:rFonts w:ascii="Courier New" w:eastAsia="Courier New" w:hAnsi="Courier New" w:cs="Courier New"/>
+          <w:sz w:val="20"/>
+        </w:rPr>
+        <w:t xml:space="preserve"> da VM (linha "inet" da placa enp0s3)</w:t>
       </w:r>
     </w:p>
     <w:p>
@@ -3610,14 +3739,17 @@
         <w:t>http://IP-DA-VM:8081/agrogest</w:t>
       </w:r>
       <w:r>
-        <w:t>, por exemplo http://192.168.1.50:8081/agrogest. Com NAT, usar http://localhost:8081/agrogest no Windows.</w:t>
+        <w:t xml:space="preserve">, por exemplo http://192.168.1.50:8081/agrogest. Com NAT, usar </w:t>
+      </w:r>
+      <w:r>
+        <w:t>http://localhost:8081/agrogest no Windows.</w:t>
       </w:r>
     </w:p>
     <w:p>
       <w:pPr>
         <w:pStyle w:val="Heading1"/>
       </w:pPr>
-      <w:bookmarkStart w:id="16" w:name="_Toc244110606"/>
+      <w:bookmarkStart w:id="16" w:name="_Toc244119073"/>
       <w:r>
         <w:t>5. Problemas comuns</w:t>
       </w:r>
@@ -3704,7 +3836,10 @@
               <w:jc w:val="left"/>
             </w:pPr>
             <w:r>
-              <w:t>Reinstalar o JDK com a opção Set JAVA_HOME variable (secção 2.1) ou definir a variável JAVA_HOME manualmente. Abrir uma nova Linha de Comandos.</w:t>
+              <w:t>Reinstalar o JDK com a opção Set JAVA_HOME variable (secção 2.1) ou definir a variável JAVA_HOME manualmente. Abr</w:t>
+            </w:r>
+            <w:r>
+              <w:t>ir uma nova Linha de Comandos.</w:t>
             </w:r>
           </w:p>
         </w:tc>
@@ -3770,7 +3905,10 @@
               <w:jc w:val="left"/>
             </w:pPr>
             <w:r>
-              <w:t>Outro programa usa a porta 8081 (no Linux: sudo ss -tlnp | grep 8081). Fechar esse programa ou escolher outra porta.</w:t>
+              <w:t>Outro programa usa a porta 8081 (no Linux: sudo ss -tlnp | grep 8</w:t>
+            </w:r>
+            <w:r>
+              <w:t>081). Fechar esse programa ou escolher outra porta.</w:t>
             </w:r>
           </w:p>
         </w:tc>
@@ -3836,7 +3974,10 @@
               <w:jc w:val="left"/>
             </w:pPr>
             <w:r>
-              <w:t>O Tomcat foi terminado à força. Parar sempre com shutdown.bat ou systemctl stop, ou usar Persistência &gt; Gravar agora antes de desligar.</w:t>
+              <w:t xml:space="preserve">O Tomcat foi </w:t>
+            </w:r>
+            <w:r>
+              <w:t>terminado à força. Parar sempre com shutdown.bat ou systemctl stop, ou usar Persistência &gt; Gravar agora antes de desligar.</w:t>
             </w:r>
           </w:p>
         </w:tc>
@@ -3869,7 +4010,10 @@
               <w:jc w:val="left"/>
             </w:pPr>
             <w:r>
-              <w:t>Ver journalctl -u tomcat -n 50. Confirmar o JAVA_HOME (ls /usr/lib/jvm/) no tomcat.service e executar sudo systemctl daemon-reload &amp;&amp; sudo systemctl restart tomcat.</w:t>
+              <w:t>Ver journalctl -u tomcat -n 50. Confirmar o JAVA_HOME (ls /usr/lib/jvm/) no tomcat.service e executar</w:t>
+            </w:r>
+            <w:r>
+              <w:t xml:space="preserve"> sudo systemctl daemon-reload &amp;&amp; sudo systemctl restart tomcat.</w:t>
             </w:r>
           </w:p>
         </w:tc>
@@ -3935,7 +4079,10 @@
               <w:jc w:val="left"/>
             </w:pPr>
             <w:r>
-              <w:t>Rede da VM não está em ponte, ufw sem a regra 8081 ou rede Wi-Fi com isolamento de clientes.</w:t>
+              <w:t xml:space="preserve">Rede da VM não está em ponte, ufw sem a regra 8081 ou rede Wi-Fi com isolamento </w:t>
+            </w:r>
+            <w:r>
+              <w:t>de clientes.</w:t>
             </w:r>
           </w:p>
         </w:tc>
@@ -3968,7 +4115,11 @@
               <w:jc w:val="left"/>
             </w:pPr>
             <w:r>
-              <w:t>C:\maven\bin não está no PATH ou a Linha de Comandos foi aberta antes de alterar o PATH.</w:t>
+              <w:t xml:space="preserve">C:\maven\bin não está no PATH ou a Linha de </w:t>
+            </w:r>
+            <w:r>
+              <w:lastRenderedPageBreak/>
+              <w:t>Comandos foi aberta antes de alterar o PATH.</w:t>
             </w:r>
           </w:p>
         </w:tc>
@@ -3983,7 +4134,7 @@
       <w:pPr>
         <w:pStyle w:val="Heading1"/>
       </w:pPr>
-      <w:bookmarkStart w:id="17" w:name="_Toc244110607"/>
+      <w:bookmarkStart w:id="17" w:name="_Toc244119074"/>
       <w:r>
         <w:t>6. Sugestão de sequência para a demonstração</w:t>
       </w:r>
@@ -3991,7 +4142,10 @@
     </w:p>
     <w:p>
       <w:r>
-        <w:t>A sequência abaixo segue os exemplos de fluxo do enunciado e passa por todos os critérios de avaliação. O Manual de Utilização mostra cada ecrã.</w:t>
+        <w:t>A sequência abaixo segue os exemplos de fluxo do enunciado e passa por todos os crit</w:t>
+      </w:r>
+      <w:r>
+        <w:t>érios de avaliação. O Manual de Utilização mostra cada ecrã.</w:t>
       </w:r>
     </w:p>
     <w:p>
@@ -4047,7 +4201,10 @@
       </w:r>
       <w:r>
         <w:tab/>
-        <w:t>Produtos: criar "Semente Feijão nhemba" (SEMENTE, 320 MT, 400 kg, validade 15/06/2027); mostrar Repor stock.</w:t>
+        <w:t xml:space="preserve">Produtos: criar "Semente Feijão nhemba" </w:t>
+      </w:r>
+      <w:r>
+        <w:t>(SEMENTE, 320 MT, 400 kg, validade 15/06/2027); mostrar Repor stock.</w:t>
       </w:r>
     </w:p>
     <w:p>
@@ -4095,7 +4252,10 @@
       </w:r>
       <w:r>
         <w:tab/>
-        <w:t>Colheitas: registar 3200 kg a 22 MT/kg e mostrar o total de 70.400,00 MT.</w:t>
+        <w:t>Colheitas: registar 3200 kg a 22</w:t>
+      </w:r>
+      <w:r>
+        <w:t xml:space="preserve"> MT/kg e mostrar o total de 70.400,00 MT.</w:t>
       </w:r>
     </w:p>
     <w:p>
@@ -4167,7 +4327,10 @@
       </w:r>
       <w:r>
         <w:tab/>
-        <w:t>Catálogo: filtrar por categoria; adicionar 3 kg de Milho e 1 saco de Adubo.</w:t>
+        <w:t>Catá</w:t>
+      </w:r>
+      <w:r>
+        <w:t>logo: filtrar por categoria; adicionar 3 kg de Milho e 1 saco de Adubo.</w:t>
       </w:r>
     </w:p>
     <w:p>
@@ -4199,7 +4362,10 @@
       </w:r>
       <w:r>
         <w:tab/>
-        <w:t>Finalizar compra, confirmar e mostrar a factura (FT-2026-5 com os dados de exemplo) com IVA 16%; imprimir com Ctrl+P.</w:t>
+        <w:t xml:space="preserve">Finalizar compra, confirmar e mostrar a factura (FT-2026-5 com os dados de </w:t>
+      </w:r>
+      <w:r>
+        <w:t>exemplo) com IVA 16%; imprimir com Ctrl+P.</w:t>
       </w:r>
     </w:p>
     <w:p>
@@ -4271,7 +4437,10 @@
       </w:r>
       <w:r>
         <w:tab/>
-        <w:t>Listagens: Produtos (ordenar por preço e stock), Armazém, Clientes, Compras detalhadas.</w:t>
+        <w:t>Listagens: Produtos (ordenar por preço e s</w:t>
+      </w:r>
+      <w:r>
+        <w:t>tock), Armazém, Clientes, Compras detalhadas.</w:t>
       </w:r>
     </w:p>
     <w:p>
@@ -4283,6 +4452,7 @@
         <w:ind w:left="567" w:hanging="340"/>
       </w:pPr>
       <w:r>
+        <w:lastRenderedPageBreak/>
         <w:t>2.</w:t>
       </w:r>
       <w:r>
@@ -4303,7 +4473,10 @@
       </w:r>
       <w:r>
         <w:tab/>
-        <w:t>Persistência: Gravar agora; reiniciar o Tomcat (systemctl restart tomcat ou shutdown.bat e startup.bat) e mostrar que os dados foram restaurados.</w:t>
+        <w:t>Persistência: Gravar agora; reiniciar o Tomcat (systemctl restart tomcat ou shutdown.bat e startup.bat) e mostrar que os dados foram</w:t>
+      </w:r>
+      <w:r>
+        <w:t xml:space="preserve"> restaurados.</w:t>
       </w:r>
     </w:p>
     <w:p>
@@ -4335,7 +4508,10 @@
       </w:r>
       <w:r>
         <w:tab/>
-        <w:t>Se for pedido, mostrar systemctl status tomcat no Linux.</w:t>
+        <w:t>Se for pedido, mostrar systemctl status tomcat no L</w:t>
+      </w:r>
+      <w:r>
+        <w:t>inux.</w:t>
       </w:r>
     </w:p>
     <w:sectPr>
@@ -4914,6 +5090,11 @@
     <w:lsdException w:name="Book Title" w:uiPriority="33" w:qFormat="1"/>
     <w:lsdException w:name="Bibliography" w:semiHidden="1" w:uiPriority="37" w:unhideWhenUsed="1"/>
     <w:lsdException w:name="TOC Heading" w:semiHidden="1" w:uiPriority="39" w:unhideWhenUsed="1" w:qFormat="1"/>
+    <w:lsdException w:name="Plain Table 5" w:semiHidden="1" w:unhideWhenUsed="1"/>
+    <w:lsdException w:name="Grid Table Light" w:semiHidden="1" w:unhideWhenUsed="1"/>
+    <w:lsdException w:name="Grid Table 1 Light" w:semiHidden="1" w:unhideWhenUsed="1"/>
+    <w:lsdException w:name="Grid Table 2" w:semiHidden="1" w:unhideWhenUsed="1"/>
+    <w:lsdException w:name="Grid Table 3" w:semiHidden="1" w:unhideWhenUsed="1"/>
     <w:lsdException w:name="Grid Table 4" w:uiPriority="49"/>
     <w:lsdException w:name="Grid Table 5 Dark" w:uiPriority="50"/>
     <w:lsdException w:name="Grid Table 6 Colorful" w:uiPriority="51"/>
@@ -16002,7 +16183,7 @@
     <w:autoRedefine/>
     <w:uiPriority w:val="39"/>
     <w:unhideWhenUsed/>
-    <w:rsid w:val="007E7030"/>
+    <w:rsid w:val="00A624B2"/>
     <w:pPr>
       <w:spacing w:after="100"/>
     </w:pPr>
@@ -16014,7 +16195,7 @@
     <w:autoRedefine/>
     <w:uiPriority w:val="39"/>
     <w:unhideWhenUsed/>
-    <w:rsid w:val="007E7030"/>
+    <w:rsid w:val="00A624B2"/>
     <w:pPr>
       <w:spacing w:after="100"/>
       <w:ind w:left="240"/>
@@ -16025,7 +16206,7 @@
     <w:basedOn w:val="DefaultParagraphFont"/>
     <w:uiPriority w:val="99"/>
     <w:unhideWhenUsed/>
-    <w:rsid w:val="007E7030"/>
+    <w:rsid w:val="00A624B2"/>
     <w:rPr>
       <w:color w:val="0000FF" w:themeColor="hyperlink"/>
       <w:u w:val="single"/>

</xml_diff>